<commit_message>
fix: remove right panel grid, add health check route, fix render URLs, add SPA redirects
</commit_message>
<xml_diff>
--- a/КМ04 курсовой критерийлері.docx
+++ b/КМ04 курсовой критерийлері.docx
@@ -9591,7 +9591,7 @@
           <w:bCs/>
           <w:sz w:val="24"/>
           <w:szCs w:val="24"/>
-          <w:lang w:val="kk-KZ"/>
+          <w:lang w:val="en-US"/>
         </w:rPr>
       </w:pPr>
       <w:r>
@@ -9604,18 +9604,6 @@
         <w:t>__________ Жақсылық Ә.Ғ</w:t>
       </w:r>
     </w:p>
-    <w:p>
-      <w:pPr>
-        <w:spacing w:line="0" w:lineRule="atLeast"/>
-        <w:rPr>
-          <w:bCs/>
-          <w:sz w:val="24"/>
-          <w:szCs w:val="24"/>
-          <w:lang w:val="kk-KZ"/>
-        </w:rPr>
-      </w:pPr>
-    </w:p>
-    <w:p/>
     <w:sectPr>
       <w:pgSz w:w="11906" w:h="16838"/>
       <w:pgMar w:top="1134" w:right="850" w:bottom="1134" w:left="1701" w:header="708" w:footer="708" w:gutter="0"/>

</xml_diff>